<commit_message>
Replace Shimizu with Kun Zhang as suggested reviewer
Shimizu is at the same institution as the author. Replaced with
Prof. Kun Zhang (CMU) - expert on causal discovery and identifiability.

Co-Authored-By: Tatsuki Onishi <bougtoir@gmail.com>
</commit_message>
<xml_diff>
--- a/spectral-causality-brainstorm/cover_letter_jci.docx
+++ b/spectral-causality-brainstorm/cover_letter_jci.docx
@@ -132,14 +132,6 @@
         <w:pStyle w:val="ListBullet"/>
       </w:pPr>
       <w:r>
-        <w:t>Prof. Shohei Shimizu (Shiga University, Japan) — Developer of LiNGAM; expert on non-Gaussian causal discovery methods.</w:t>
-      </w:r>
-    </w:p>
-    <w:p>
-      <w:pPr>
-        <w:pStyle w:val="ListBullet"/>
-      </w:pPr>
-      <w:r>
         <w:t>Prof. Markus Püschel (ETH Zürich, Switzerland) — Pioneer of causal Fourier analysis on DAGs; expert on graph signal processing.</w:t>
       </w:r>
     </w:p>
@@ -149,6 +141,14 @@
       </w:pPr>
       <w:r>
         <w:t>Prof. Michael Schaub (RWTH Aachen University, Germany) — Expert on Hodge decomposition and spectral methods for network analysis.</w:t>
+      </w:r>
+    </w:p>
+    <w:p>
+      <w:pPr>
+        <w:pStyle w:val="ListBullet"/>
+      </w:pPr>
+      <w:r>
+        <w:t>Prof. Kun Zhang (Carnegie Mellon University, USA) — Expert on causal discovery, non-linear causal models, and identifiability theory.</w:t>
       </w:r>
     </w:p>
     <w:p/>

</xml_diff>